<commit_message>
Add Test Cases 1-4 (conditions 1-4)
</commit_message>
<xml_diff>
--- a/Documentation/Test Cases.docx
+++ b/Documentation/Test Cases.docx
@@ -437,31 +437,349 @@
           <w:tcPr>
             <w:tcW w:w="1803" w:type="dxa"/>
           </w:tcPr>
-          <w:p/>
-        </w:tc>
-        <w:tc>
-          <w:tcPr>
-            <w:tcW w:w="1803" w:type="dxa"/>
-          </w:tcPr>
-          <w:p/>
-        </w:tc>
-        <w:tc>
-          <w:tcPr>
-            <w:tcW w:w="1803" w:type="dxa"/>
-          </w:tcPr>
-          <w:p/>
-        </w:tc>
-        <w:tc>
-          <w:tcPr>
-            <w:tcW w:w="1803" w:type="dxa"/>
-          </w:tcPr>
-          <w:p/>
+          <w:p>
+            <w:r>
+              <w:rPr>
+                <w:b/>
+              </w:rPr>
+              <w:t>Test Case 1</w:t>
+            </w:r>
+          </w:p>
+          <w:p>
+            <w:r>
+              <w:t>Course.createNewAssessment</w:t>
+            </w:r>
+          </w:p>
+          <w:p>
+            <w:r>
+              <w:t>Duplicate name</w:t>
+            </w:r>
+          </w:p>
+        </w:tc>
+        <w:tc>
+          <w:tcPr>
+            <w:tcW w:w="1803" w:type="dxa"/>
+          </w:tcPr>
+          <w:p>
+            <w:r>
+              <w:t>"quiz1", "second quiz description", 20</w:t>
+            </w:r>
+          </w:p>
+          <w:p>
+            <w:r>
+              <w:t>Precondition: "quiz1" already added (list size 1)</w:t>
+            </w:r>
+          </w:p>
+        </w:tc>
+        <w:tc>
+          <w:tcPr>
+            <w:tcW w:w="1803" w:type="dxa"/>
+          </w:tcPr>
+          <w:p>
+            <w:r>
+              <w:t>False (list size stays 1)</w:t>
+            </w:r>
+          </w:p>
+        </w:tc>
+        <w:tc>
+          <w:tcPr>
+            <w:tcW w:w="1803" w:type="dxa"/>
+          </w:tcPr>
+          <w:p>
+            <w:r>
+              <w:t>False (list size 1)</w:t>
+            </w:r>
+          </w:p>
         </w:tc>
         <w:tc>
           <w:tcPr>
             <w:tcW w:w="1804" w:type="dxa"/>
           </w:tcPr>
-          <w:p/>
+          <w:p>
+            <w:r>
+              <w:t>Pass</w:t>
+            </w:r>
+          </w:p>
+        </w:tc>
+      </w:tr>
+      <w:tr>
+        <w:tc>
+          <w:tcPr>
+            <w:tcW w:w="1803" w:type="dxa"/>
+          </w:tcPr>
+          <w:p>
+            <w:r>
+              <w:rPr>
+                <w:b/>
+              </w:rPr>
+              <w:t>Test Case 2</w:t>
+            </w:r>
+          </w:p>
+          <w:p>
+            <w:r>
+              <w:t>Course.createNewAssessment</w:t>
+            </w:r>
+          </w:p>
+          <w:p>
+            <w:r>
+              <w:t>Blank name</w:t>
+            </w:r>
+          </w:p>
+        </w:tc>
+        <w:tc>
+          <w:tcPr>
+            <w:tcW w:w="1803" w:type="dxa"/>
+          </w:tcPr>
+          <w:p>
+            <w:r>
+              <w:t>"", "a valid description", 20</w:t>
+            </w:r>
+          </w:p>
+          <w:p>
+            <w:r>
+              <w:t>Precondition: list empty</w:t>
+            </w:r>
+          </w:p>
+        </w:tc>
+        <w:tc>
+          <w:tcPr>
+            <w:tcW w:w="1803" w:type="dxa"/>
+          </w:tcPr>
+          <w:p>
+            <w:r>
+              <w:t>False (list size stays 0)</w:t>
+            </w:r>
+          </w:p>
+        </w:tc>
+        <w:tc>
+          <w:tcPr>
+            <w:tcW w:w="1803" w:type="dxa"/>
+          </w:tcPr>
+          <w:p>
+            <w:r>
+              <w:t>False (list size 0)</w:t>
+            </w:r>
+          </w:p>
+        </w:tc>
+        <w:tc>
+          <w:tcPr>
+            <w:tcW w:w="1804" w:type="dxa"/>
+          </w:tcPr>
+          <w:p>
+            <w:r>
+              <w:t>Pass</w:t>
+            </w:r>
+          </w:p>
+        </w:tc>
+      </w:tr>
+      <w:tr>
+        <w:tc>
+          <w:tcPr>
+            <w:tcW w:w="1803" w:type="dxa"/>
+          </w:tcPr>
+          <w:p>
+            <w:r>
+              <w:rPr>
+                <w:b/>
+              </w:rPr>
+              <w:t>Test Case 3</w:t>
+            </w:r>
+          </w:p>
+          <w:p>
+            <w:r>
+              <w:t>Course.createNewAssessment</w:t>
+            </w:r>
+          </w:p>
+          <w:p>
+            <w:r>
+              <w:t>Description under 3 words</w:t>
+            </w:r>
+          </w:p>
+        </w:tc>
+        <w:tc>
+          <w:tcPr>
+            <w:tcW w:w="1803" w:type="dxa"/>
+          </w:tcPr>
+          <w:p>
+            <w:r>
+              <w:t>"quiz1", "two words", 20</w:t>
+            </w:r>
+          </w:p>
+          <w:p>
+            <w:r>
+              <w:t>Precondition: list empty</w:t>
+            </w:r>
+          </w:p>
+        </w:tc>
+        <w:tc>
+          <w:tcPr>
+            <w:tcW w:w="1803" w:type="dxa"/>
+          </w:tcPr>
+          <w:p>
+            <w:r>
+              <w:t>False (list size stays 0)</w:t>
+            </w:r>
+          </w:p>
+        </w:tc>
+        <w:tc>
+          <w:tcPr>
+            <w:tcW w:w="1803" w:type="dxa"/>
+          </w:tcPr>
+          <w:p>
+            <w:r>
+              <w:t>False (list size 0)</w:t>
+            </w:r>
+          </w:p>
+        </w:tc>
+        <w:tc>
+          <w:tcPr>
+            <w:tcW w:w="1804" w:type="dxa"/>
+          </w:tcPr>
+          <w:p>
+            <w:r>
+              <w:t>Pass</w:t>
+            </w:r>
+          </w:p>
+        </w:tc>
+      </w:tr>
+      <w:tr>
+        <w:tc>
+          <w:tcPr>
+            <w:tcW w:w="1803" w:type="dxa"/>
+          </w:tcPr>
+          <w:p>
+            <w:r>
+              <w:rPr>
+                <w:b/>
+              </w:rPr>
+              <w:t>Test Case 4</w:t>
+            </w:r>
+          </w:p>
+          <w:p>
+            <w:r>
+              <w:t>Course.createNewAssessment</w:t>
+            </w:r>
+          </w:p>
+          <w:p>
+            <w:r>
+              <w:t>Points not greater than 0</w:t>
+            </w:r>
+          </w:p>
+        </w:tc>
+        <w:tc>
+          <w:tcPr>
+            <w:tcW w:w="1803" w:type="dxa"/>
+          </w:tcPr>
+          <w:p>
+            <w:r>
+              <w:t>"quiz1", "a valid description", 0</w:t>
+            </w:r>
+          </w:p>
+          <w:p>
+            <w:r>
+              <w:t>Precondition: list empty</w:t>
+            </w:r>
+          </w:p>
+        </w:tc>
+        <w:tc>
+          <w:tcPr>
+            <w:tcW w:w="1803" w:type="dxa"/>
+          </w:tcPr>
+          <w:p>
+            <w:r>
+              <w:t>False (list size stays 0)</w:t>
+            </w:r>
+          </w:p>
+        </w:tc>
+        <w:tc>
+          <w:tcPr>
+            <w:tcW w:w="1803" w:type="dxa"/>
+          </w:tcPr>
+          <w:p>
+            <w:r>
+              <w:t>False (list size 0)</w:t>
+            </w:r>
+          </w:p>
+        </w:tc>
+        <w:tc>
+          <w:tcPr>
+            <w:tcW w:w="1804" w:type="dxa"/>
+          </w:tcPr>
+          <w:p>
+            <w:r>
+              <w:t>Pass</w:t>
+            </w:r>
+          </w:p>
+        </w:tc>
+      </w:tr>
+      <w:tr>
+        <w:tc>
+          <w:tcPr>
+            <w:tcW w:w="1803" w:type="dxa"/>
+          </w:tcPr>
+          <w:p>
+            <w:r>
+              <w:rPr>
+                <w:b/>
+              </w:rPr>
+              <w:t>Test Case 1-4</w:t>
+            </w:r>
+          </w:p>
+          <w:p>
+            <w:r>
+              <w:t>Course.createNewAssessment</w:t>
+            </w:r>
+          </w:p>
+          <w:p>
+            <w:r>
+              <w:t>Valid boundary input</w:t>
+            </w:r>
+          </w:p>
+        </w:tc>
+        <w:tc>
+          <w:tcPr>
+            <w:tcW w:w="1803" w:type="dxa"/>
+          </w:tcPr>
+          <w:p>
+            <w:r>
+              <w:t>"quiz1", "three word description", 1</w:t>
+            </w:r>
+          </w:p>
+          <w:p>
+            <w:r>
+              <w:t>Precondition: list empty</w:t>
+            </w:r>
+          </w:p>
+        </w:tc>
+        <w:tc>
+          <w:tcPr>
+            <w:tcW w:w="1803" w:type="dxa"/>
+          </w:tcPr>
+          <w:p>
+            <w:r>
+              <w:t>True (1 object stored with matching name, description and points)</w:t>
+            </w:r>
+          </w:p>
+        </w:tc>
+        <w:tc>
+          <w:tcPr>
+            <w:tcW w:w="1803" w:type="dxa"/>
+          </w:tcPr>
+          <w:p>
+            <w:r>
+              <w:t>True (list size 1, attributes match)</w:t>
+            </w:r>
+          </w:p>
+        </w:tc>
+        <w:tc>
+          <w:tcPr>
+            <w:tcW w:w="1804" w:type="dxa"/>
+          </w:tcPr>
+          <w:p>
+            <w:r>
+              <w:t>Pass</w:t>
+            </w:r>
+          </w:p>
         </w:tc>
       </w:tr>
     </w:tbl>

</xml_diff>

<commit_message>
Update test cases conditions 1-4: add TC1 setup, remove TC5
</commit_message>
<xml_diff>
--- a/Documentation/Test Cases.docx
+++ b/Documentation/Test Cases.docx
@@ -9,16 +9,16 @@
         <w:tblLook w:val="04A0" w:firstRow="1" w:lastRow="0" w:firstColumn="1" w:lastColumn="0" w:noHBand="0" w:noVBand="1"/>
       </w:tblPr>
       <w:tblGrid>
-        <w:gridCol w:w="2612"/>
-        <w:gridCol w:w="1699"/>
-        <w:gridCol w:w="1623"/>
-        <w:gridCol w:w="1561"/>
-        <w:gridCol w:w="1521"/>
+        <w:gridCol w:w="2911"/>
+        <w:gridCol w:w="1654"/>
+        <w:gridCol w:w="1578"/>
+        <w:gridCol w:w="1527"/>
+        <w:gridCol w:w="1346"/>
       </w:tblGrid>
       <w:tr>
         <w:tc>
           <w:tcPr>
-            <w:tcW w:w="1803" w:type="dxa"/>
+            <w:tcW w:w="2911" w:type="dxa"/>
           </w:tcPr>
           <w:p>
             <w:pPr>
@@ -38,7 +38,7 @@
         </w:tc>
         <w:tc>
           <w:tcPr>
-            <w:tcW w:w="1803" w:type="dxa"/>
+            <w:tcW w:w="1654" w:type="dxa"/>
           </w:tcPr>
           <w:p>
             <w:pPr>
@@ -58,7 +58,7 @@
         </w:tc>
         <w:tc>
           <w:tcPr>
-            <w:tcW w:w="1803" w:type="dxa"/>
+            <w:tcW w:w="1578" w:type="dxa"/>
           </w:tcPr>
           <w:p>
             <w:pPr>
@@ -78,7 +78,7 @@
         </w:tc>
         <w:tc>
           <w:tcPr>
-            <w:tcW w:w="1803" w:type="dxa"/>
+            <w:tcW w:w="1527" w:type="dxa"/>
           </w:tcPr>
           <w:p>
             <w:pPr>
@@ -98,7 +98,7 @@
         </w:tc>
         <w:tc>
           <w:tcPr>
-            <w:tcW w:w="1804" w:type="dxa"/>
+            <w:tcW w:w="1346" w:type="dxa"/>
           </w:tcPr>
           <w:p>
             <w:pPr>
@@ -120,7 +120,7 @@
       <w:tr>
         <w:tc>
           <w:tcPr>
-            <w:tcW w:w="1803" w:type="dxa"/>
+            <w:tcW w:w="2911" w:type="dxa"/>
           </w:tcPr>
           <w:p>
             <w:pPr>
@@ -155,7 +155,7 @@
         </w:tc>
         <w:tc>
           <w:tcPr>
-            <w:tcW w:w="1803" w:type="dxa"/>
+            <w:tcW w:w="1654" w:type="dxa"/>
           </w:tcPr>
           <w:p>
             <w:r>
@@ -176,7 +176,7 @@
         </w:tc>
         <w:tc>
           <w:tcPr>
-            <w:tcW w:w="1803" w:type="dxa"/>
+            <w:tcW w:w="1578" w:type="dxa"/>
           </w:tcPr>
           <w:p>
             <w:r>
@@ -186,7 +186,7 @@
         </w:tc>
         <w:tc>
           <w:tcPr>
-            <w:tcW w:w="1803" w:type="dxa"/>
+            <w:tcW w:w="1527" w:type="dxa"/>
           </w:tcPr>
           <w:p>
             <w:r>
@@ -196,7 +196,7 @@
         </w:tc>
         <w:tc>
           <w:tcPr>
-            <w:tcW w:w="1804" w:type="dxa"/>
+            <w:tcW w:w="1346" w:type="dxa"/>
           </w:tcPr>
           <w:p>
             <w:r>
@@ -208,7 +208,7 @@
       <w:tr>
         <w:tc>
           <w:tcPr>
-            <w:tcW w:w="1803" w:type="dxa"/>
+            <w:tcW w:w="2911" w:type="dxa"/>
           </w:tcPr>
           <w:p>
             <w:pPr>
@@ -228,10 +228,7 @@
           <w:p>
             <w:proofErr w:type="spellStart"/>
             <w:r>
-              <w:t>Course.dateOrderValidato</w:t>
-            </w:r>
-            <w:r>
-              <w:t>r</w:t>
+              <w:t>Course.dateOrderValidator</w:t>
             </w:r>
             <w:proofErr w:type="spellEnd"/>
           </w:p>
@@ -248,7 +245,7 @@
         </w:tc>
         <w:tc>
           <w:tcPr>
-            <w:tcW w:w="1803" w:type="dxa"/>
+            <w:tcW w:w="1654" w:type="dxa"/>
           </w:tcPr>
           <w:p>
             <w:r>
@@ -269,7 +266,7 @@
         </w:tc>
         <w:tc>
           <w:tcPr>
-            <w:tcW w:w="1803" w:type="dxa"/>
+            <w:tcW w:w="1578" w:type="dxa"/>
           </w:tcPr>
           <w:p>
             <w:r>
@@ -279,13 +276,13 @@
         </w:tc>
         <w:tc>
           <w:tcPr>
-            <w:tcW w:w="1803" w:type="dxa"/>
+            <w:tcW w:w="1527" w:type="dxa"/>
           </w:tcPr>
           <w:p/>
         </w:tc>
         <w:tc>
           <w:tcPr>
-            <w:tcW w:w="1804" w:type="dxa"/>
+            <w:tcW w:w="1346" w:type="dxa"/>
           </w:tcPr>
           <w:p/>
         </w:tc>
@@ -293,7 +290,7 @@
       <w:tr>
         <w:tc>
           <w:tcPr>
-            <w:tcW w:w="1803" w:type="dxa"/>
+            <w:tcW w:w="2911" w:type="dxa"/>
           </w:tcPr>
           <w:p>
             <w:pPr>
@@ -313,10 +310,7 @@
           <w:p>
             <w:proofErr w:type="spellStart"/>
             <w:r>
-              <w:t>Course.dateOrderValidato</w:t>
-            </w:r>
-            <w:r>
-              <w:t>r</w:t>
+              <w:t>Course.dateOrderValidator</w:t>
             </w:r>
             <w:proofErr w:type="spellEnd"/>
           </w:p>
@@ -328,7 +322,7 @@
         </w:tc>
         <w:tc>
           <w:tcPr>
-            <w:tcW w:w="1803" w:type="dxa"/>
+            <w:tcW w:w="1654" w:type="dxa"/>
           </w:tcPr>
           <w:p>
             <w:r>
@@ -349,19 +343,19 @@
         </w:tc>
         <w:tc>
           <w:tcPr>
-            <w:tcW w:w="1803" w:type="dxa"/>
+            <w:tcW w:w="1578" w:type="dxa"/>
           </w:tcPr>
           <w:p/>
         </w:tc>
         <w:tc>
           <w:tcPr>
-            <w:tcW w:w="1803" w:type="dxa"/>
+            <w:tcW w:w="1527" w:type="dxa"/>
           </w:tcPr>
           <w:p/>
         </w:tc>
         <w:tc>
           <w:tcPr>
-            <w:tcW w:w="1804" w:type="dxa"/>
+            <w:tcW w:w="1346" w:type="dxa"/>
           </w:tcPr>
           <w:p/>
         </w:tc>
@@ -369,7 +363,7 @@
       <w:tr>
         <w:tc>
           <w:tcPr>
-            <w:tcW w:w="1803" w:type="dxa"/>
+            <w:tcW w:w="2911" w:type="dxa"/>
           </w:tcPr>
           <w:p>
             <w:pPr>
@@ -409,25 +403,25 @@
         </w:tc>
         <w:tc>
           <w:tcPr>
-            <w:tcW w:w="1803" w:type="dxa"/>
+            <w:tcW w:w="1654" w:type="dxa"/>
           </w:tcPr>
           <w:p/>
         </w:tc>
         <w:tc>
           <w:tcPr>
-            <w:tcW w:w="1803" w:type="dxa"/>
+            <w:tcW w:w="1578" w:type="dxa"/>
           </w:tcPr>
           <w:p/>
         </w:tc>
         <w:tc>
           <w:tcPr>
-            <w:tcW w:w="1803" w:type="dxa"/>
+            <w:tcW w:w="1527" w:type="dxa"/>
           </w:tcPr>
           <w:p/>
         </w:tc>
         <w:tc>
           <w:tcPr>
-            <w:tcW w:w="1804" w:type="dxa"/>
+            <w:tcW w:w="1346" w:type="dxa"/>
           </w:tcPr>
           <w:p/>
         </w:tc>
@@ -435,65 +429,116 @@
       <w:tr>
         <w:tc>
           <w:tcPr>
-            <w:tcW w:w="1803" w:type="dxa"/>
-          </w:tcPr>
-          <w:p>
-            <w:r>
-              <w:rPr>
-                <w:b/>
-              </w:rPr>
-              <w:t>Test Case 1</w:t>
-            </w:r>
-          </w:p>
-          <w:p>
-            <w:r>
-              <w:t>Course.createNewAssessment</w:t>
-            </w:r>
-          </w:p>
-          <w:p>
-            <w:r>
-              <w:t>Duplicate name</w:t>
-            </w:r>
-          </w:p>
-        </w:tc>
-        <w:tc>
-          <w:tcPr>
-            <w:tcW w:w="1803" w:type="dxa"/>
-          </w:tcPr>
-          <w:p>
-            <w:r>
-              <w:t>"quiz1", "second quiz description", 20</w:t>
-            </w:r>
-          </w:p>
-          <w:p>
-            <w:r>
-              <w:t>Precondition: "quiz1" already added (list size 1)</w:t>
-            </w:r>
-          </w:p>
-        </w:tc>
-        <w:tc>
-          <w:tcPr>
-            <w:tcW w:w="1803" w:type="dxa"/>
-          </w:tcPr>
-          <w:p>
-            <w:r>
-              <w:t>False (list size stays 1)</w:t>
-            </w:r>
-          </w:p>
-        </w:tc>
-        <w:tc>
-          <w:tcPr>
-            <w:tcW w:w="1803" w:type="dxa"/>
-          </w:tcPr>
-          <w:p>
-            <w:r>
-              <w:t>False (list size 1)</w:t>
-            </w:r>
-          </w:p>
-        </w:tc>
-        <w:tc>
-          <w:tcPr>
-            <w:tcW w:w="1804" w:type="dxa"/>
+            <w:tcW w:w="2911" w:type="dxa"/>
+          </w:tcPr>
+          <w:p>
+            <w:pPr>
+              <w:rPr>
+                <w:rFonts w:asciiTheme="majorBidi" w:hAnsiTheme="majorBidi" w:cstheme="majorBidi"/>
+                <w:lang w:val="en-US"/>
+              </w:rPr>
+            </w:pPr>
+            <w:r>
+              <w:rPr>
+                <w:rFonts w:asciiTheme="majorBidi" w:hAnsiTheme="majorBidi" w:cstheme="majorBidi"/>
+                <w:b/>
+                <w:lang w:val="en-US"/>
+              </w:rPr>
+              <w:t>Test Case 1.</w:t>
+            </w:r>
+          </w:p>
+          <w:p>
+            <w:pPr>
+              <w:rPr>
+                <w:rFonts w:asciiTheme="majorBidi" w:hAnsiTheme="majorBidi" w:cstheme="majorBidi"/>
+                <w:lang w:val="en-US"/>
+              </w:rPr>
+            </w:pPr>
+            <w:r>
+              <w:rPr>
+                <w:rFonts w:asciiTheme="majorBidi" w:hAnsiTheme="majorBidi" w:cstheme="majorBidi"/>
+                <w:lang w:val="en-US"/>
+              </w:rPr>
+              <w:t>Check the function with a duplicate assessment name (Condition 1).</w:t>
+            </w:r>
+          </w:p>
+          <w:p>
+            <w:r>
+              <w:rPr>
+                <w:rFonts w:asciiTheme="majorBidi" w:hAnsiTheme="majorBidi" w:cstheme="majorBidi"/>
+                <w:lang w:val="en-US"/>
+              </w:rPr>
+              <w:t>Precondition: an assessment named "quiz1" is already in the list (list size = 1).</w:t>
+            </w:r>
+          </w:p>
+        </w:tc>
+        <w:tc>
+          <w:tcPr>
+            <w:tcW w:w="1654" w:type="dxa"/>
+          </w:tcPr>
+          <w:p>
+            <w:pPr>
+              <w:rPr>
+                <w:rFonts w:asciiTheme="majorBidi" w:hAnsiTheme="majorBidi" w:cstheme="majorBidi"/>
+                <w:lang w:val="en-US"/>
+              </w:rPr>
+            </w:pPr>
+            <w:r>
+              <w:rPr>
+                <w:rFonts w:asciiTheme="majorBidi" w:hAnsiTheme="majorBidi" w:cstheme="majorBidi"/>
+              </w:rPr>
+              <w:t>Setup: ("quiz1", "first quiz description", 20) added first</w:t>
+            </w:r>
+          </w:p>
+          <w:p>
+            <w:pPr>
+              <w:rPr>
+                <w:rFonts w:asciiTheme="majorBidi" w:hAnsiTheme="majorBidi" w:cstheme="majorBidi"/>
+                <w:lang w:val="en-US"/>
+              </w:rPr>
+            </w:pPr>
+          </w:p>
+          <w:p>
+            <w:r>
+              <w:rPr>
+                <w:rFonts w:asciiTheme="majorBidi" w:hAnsiTheme="majorBidi" w:cstheme="majorBidi"/>
+                <w:lang w:val="en-US"/>
+              </w:rPr>
+              <w:t>("quiz1", "second quiz description", 20)</w:t>
+            </w:r>
+          </w:p>
+        </w:tc>
+        <w:tc>
+          <w:tcPr>
+            <w:tcW w:w="1578" w:type="dxa"/>
+          </w:tcPr>
+          <w:p>
+            <w:r>
+              <w:rPr>
+                <w:rFonts w:asciiTheme="majorBidi" w:hAnsiTheme="majorBidi" w:cstheme="majorBidi"/>
+                <w:lang w:val="en-US"/>
+              </w:rPr>
+              <w:t>Creating this assessment should not be successful (returns false). The list size stays 1 and no new object is stored.</w:t>
+            </w:r>
+          </w:p>
+        </w:tc>
+        <w:tc>
+          <w:tcPr>
+            <w:tcW w:w="1527" w:type="dxa"/>
+          </w:tcPr>
+          <w:p>
+            <w:r>
+              <w:rPr>
+                <w:rFonts w:asciiTheme="majorBidi" w:hAnsiTheme="majorBidi" w:cstheme="majorBidi"/>
+                <w:lang w:val="en-US"/>
+              </w:rPr>
+              <w:t>Returned false. List size remained 1.</w:t>
+            </w:r>
+          </w:p>
+        </w:tc>
+        <w:tc>
+          <w:tcPr>
+            <w:tcW w:w="1346" w:type="dxa"/>
           </w:tcPr>
           <w:p>
             <w:r>
@@ -505,7 +550,7 @@
       <w:tr>
         <w:tc>
           <w:tcPr>
-            <w:tcW w:w="1803" w:type="dxa"/>
+            <w:tcW w:w="2911" w:type="dxa"/>
           </w:tcPr>
           <w:p>
             <w:r>
@@ -516,54 +561,75 @@
             </w:r>
           </w:p>
           <w:p>
-            <w:r>
-              <w:t>Course.createNewAssessment</w:t>
-            </w:r>
-          </w:p>
-          <w:p>
-            <w:r>
-              <w:t>Blank name</w:t>
-            </w:r>
-          </w:p>
-        </w:tc>
-        <w:tc>
-          <w:tcPr>
-            <w:tcW w:w="1803" w:type="dxa"/>
-          </w:tcPr>
-          <w:p>
-            <w:r>
-              <w:t>"", "a valid description", 20</w:t>
-            </w:r>
-          </w:p>
-          <w:p>
-            <w:r>
-              <w:t>Precondition: list empty</w:t>
-            </w:r>
-          </w:p>
-        </w:tc>
-        <w:tc>
-          <w:tcPr>
-            <w:tcW w:w="1803" w:type="dxa"/>
-          </w:tcPr>
-          <w:p>
-            <w:r>
-              <w:t>False (list size stays 0)</w:t>
-            </w:r>
-          </w:p>
-        </w:tc>
-        <w:tc>
-          <w:tcPr>
-            <w:tcW w:w="1803" w:type="dxa"/>
-          </w:tcPr>
-          <w:p>
-            <w:r>
-              <w:t>False (list size 0)</w:t>
-            </w:r>
-          </w:p>
-        </w:tc>
-        <w:tc>
-          <w:tcPr>
-            <w:tcW w:w="1804" w:type="dxa"/>
+            <w:pPr>
+              <w:rPr>
+                <w:rFonts w:asciiTheme="majorBidi" w:hAnsiTheme="majorBidi" w:cstheme="majorBidi"/>
+                <w:lang w:val="en-US"/>
+              </w:rPr>
+            </w:pPr>
+            <w:r>
+              <w:rPr>
+                <w:rFonts w:asciiTheme="majorBidi" w:hAnsiTheme="majorBidi" w:cstheme="majorBidi"/>
+                <w:lang w:val="en-US"/>
+              </w:rPr>
+              <w:t>Check the function with a blank assessment name (Condition 2).</w:t>
+            </w:r>
+          </w:p>
+          <w:p>
+            <w:r>
+              <w:rPr>
+                <w:rFonts w:asciiTheme="majorBidi" w:hAnsiTheme="majorBidi" w:cstheme="majorBidi"/>
+                <w:lang w:val="en-US"/>
+              </w:rPr>
+              <w:t>Precondition: list is empty (size = 0).</w:t>
+            </w:r>
+          </w:p>
+        </w:tc>
+        <w:tc>
+          <w:tcPr>
+            <w:tcW w:w="1654" w:type="dxa"/>
+          </w:tcPr>
+          <w:p>
+            <w:r>
+              <w:rPr>
+                <w:rFonts w:asciiTheme="majorBidi" w:hAnsiTheme="majorBidi" w:cstheme="majorBidi"/>
+                <w:lang w:val="en-US"/>
+              </w:rPr>
+              <w:t>("", "a valid description", 20)</w:t>
+            </w:r>
+          </w:p>
+        </w:tc>
+        <w:tc>
+          <w:tcPr>
+            <w:tcW w:w="1578" w:type="dxa"/>
+          </w:tcPr>
+          <w:p>
+            <w:r>
+              <w:rPr>
+                <w:rFonts w:asciiTheme="majorBidi" w:hAnsiTheme="majorBidi" w:cstheme="majorBidi"/>
+                <w:lang w:val="en-US"/>
+              </w:rPr>
+              <w:t>Creating this assessment should not be successful (returns false). The list size stays 0.</w:t>
+            </w:r>
+          </w:p>
+        </w:tc>
+        <w:tc>
+          <w:tcPr>
+            <w:tcW w:w="1527" w:type="dxa"/>
+          </w:tcPr>
+          <w:p>
+            <w:r>
+              <w:rPr>
+                <w:rFonts w:asciiTheme="majorBidi" w:hAnsiTheme="majorBidi" w:cstheme="majorBidi"/>
+                <w:lang w:val="en-US"/>
+              </w:rPr>
+              <w:t>Returned false. List size remained 0.</w:t>
+            </w:r>
+          </w:p>
+        </w:tc>
+        <w:tc>
+          <w:tcPr>
+            <w:tcW w:w="1346" w:type="dxa"/>
           </w:tcPr>
           <w:p>
             <w:r>
@@ -575,65 +641,93 @@
       <w:tr>
         <w:tc>
           <w:tcPr>
-            <w:tcW w:w="1803" w:type="dxa"/>
-          </w:tcPr>
-          <w:p>
-            <w:r>
-              <w:rPr>
-                <w:b/>
-              </w:rPr>
+            <w:tcW w:w="2911" w:type="dxa"/>
+          </w:tcPr>
+          <w:p>
+            <w:pPr>
+              <w:rPr>
+                <w:b/>
+              </w:rPr>
+            </w:pPr>
+            <w:r>
+              <w:rPr>
+                <w:b/>
+              </w:rPr>
+              <w:lastRenderedPageBreak/>
               <w:t>Test Case 3</w:t>
             </w:r>
           </w:p>
           <w:p>
-            <w:r>
-              <w:t>Course.createNewAssessment</w:t>
-            </w:r>
-          </w:p>
-          <w:p>
-            <w:r>
-              <w:t>Description under 3 words</w:t>
-            </w:r>
-          </w:p>
-        </w:tc>
-        <w:tc>
-          <w:tcPr>
-            <w:tcW w:w="1803" w:type="dxa"/>
-          </w:tcPr>
-          <w:p>
-            <w:r>
-              <w:t>"quiz1", "two words", 20</w:t>
-            </w:r>
-          </w:p>
-          <w:p>
-            <w:r>
-              <w:t>Precondition: list empty</w:t>
-            </w:r>
-          </w:p>
-        </w:tc>
-        <w:tc>
-          <w:tcPr>
-            <w:tcW w:w="1803" w:type="dxa"/>
-          </w:tcPr>
-          <w:p>
-            <w:r>
-              <w:t>False (list size stays 0)</w:t>
-            </w:r>
-          </w:p>
-        </w:tc>
-        <w:tc>
-          <w:tcPr>
-            <w:tcW w:w="1803" w:type="dxa"/>
-          </w:tcPr>
-          <w:p>
-            <w:r>
-              <w:t>False (list size 0)</w:t>
-            </w:r>
-          </w:p>
-        </w:tc>
-        <w:tc>
-          <w:tcPr>
-            <w:tcW w:w="1804" w:type="dxa"/>
+            <w:pPr>
+              <w:rPr>
+                <w:rFonts w:asciiTheme="majorBidi" w:hAnsiTheme="majorBidi" w:cstheme="majorBidi"/>
+                <w:lang w:val="en-US"/>
+              </w:rPr>
+            </w:pPr>
+            <w:r>
+              <w:rPr>
+                <w:rFonts w:asciiTheme="majorBidi" w:hAnsiTheme="majorBidi" w:cstheme="majorBidi"/>
+                <w:lang w:val="en-US"/>
+              </w:rPr>
+              <w:t>Check the function with a description of fewer than 3 words (Condition 3, boundary: 2 words).</w:t>
+            </w:r>
+          </w:p>
+          <w:p>
+            <w:r>
+              <w:rPr>
+                <w:rFonts w:asciiTheme="majorBidi" w:hAnsiTheme="majorBidi" w:cstheme="majorBidi"/>
+                <w:lang w:val="en-US"/>
+              </w:rPr>
+              <w:t>Precondition: list is empty (size = 0).</w:t>
+            </w:r>
+          </w:p>
+          <w:p/>
+        </w:tc>
+        <w:tc>
+          <w:tcPr>
+            <w:tcW w:w="1654" w:type="dxa"/>
+          </w:tcPr>
+          <w:p>
+            <w:r>
+              <w:rPr>
+                <w:rFonts w:asciiTheme="majorBidi" w:hAnsiTheme="majorBidi" w:cstheme="majorBidi"/>
+                <w:lang w:val="en-US"/>
+              </w:rPr>
+              <w:t>("quiz1", "two words", 20)</w:t>
+            </w:r>
+          </w:p>
+        </w:tc>
+        <w:tc>
+          <w:tcPr>
+            <w:tcW w:w="1578" w:type="dxa"/>
+          </w:tcPr>
+          <w:p>
+            <w:r>
+              <w:rPr>
+                <w:rFonts w:asciiTheme="majorBidi" w:hAnsiTheme="majorBidi" w:cstheme="majorBidi"/>
+                <w:lang w:val="en-US"/>
+              </w:rPr>
+              <w:t>Creating this assessment should not be successful (returns false). The list size stays 0.</w:t>
+            </w:r>
+          </w:p>
+        </w:tc>
+        <w:tc>
+          <w:tcPr>
+            <w:tcW w:w="1527" w:type="dxa"/>
+          </w:tcPr>
+          <w:p>
+            <w:r>
+              <w:rPr>
+                <w:rFonts w:asciiTheme="majorBidi" w:hAnsiTheme="majorBidi" w:cstheme="majorBidi"/>
+                <w:lang w:val="en-US"/>
+              </w:rPr>
+              <w:t>Returned false. List size remained 0.</w:t>
+            </w:r>
+          </w:p>
+        </w:tc>
+        <w:tc>
+          <w:tcPr>
+            <w:tcW w:w="1346" w:type="dxa"/>
           </w:tcPr>
           <w:p>
             <w:r>
@@ -645,7 +739,7 @@
       <w:tr>
         <w:tc>
           <w:tcPr>
-            <w:tcW w:w="1803" w:type="dxa"/>
+            <w:tcW w:w="2911" w:type="dxa"/>
           </w:tcPr>
           <w:p>
             <w:r>
@@ -656,124 +750,75 @@
             </w:r>
           </w:p>
           <w:p>
-            <w:r>
-              <w:t>Course.createNewAssessment</w:t>
-            </w:r>
-          </w:p>
-          <w:p>
-            <w:r>
-              <w:t>Points not greater than 0</w:t>
-            </w:r>
-          </w:p>
-        </w:tc>
-        <w:tc>
-          <w:tcPr>
-            <w:tcW w:w="1803" w:type="dxa"/>
-          </w:tcPr>
-          <w:p>
-            <w:r>
-              <w:t>"quiz1", "a valid description", 0</w:t>
-            </w:r>
-          </w:p>
-          <w:p>
-            <w:r>
-              <w:t>Precondition: list empty</w:t>
-            </w:r>
-          </w:p>
-        </w:tc>
-        <w:tc>
-          <w:tcPr>
-            <w:tcW w:w="1803" w:type="dxa"/>
-          </w:tcPr>
-          <w:p>
-            <w:r>
-              <w:t>False (list size stays 0)</w:t>
-            </w:r>
-          </w:p>
-        </w:tc>
-        <w:tc>
-          <w:tcPr>
-            <w:tcW w:w="1803" w:type="dxa"/>
-          </w:tcPr>
-          <w:p>
-            <w:r>
-              <w:t>False (list size 0)</w:t>
-            </w:r>
-          </w:p>
-        </w:tc>
-        <w:tc>
-          <w:tcPr>
-            <w:tcW w:w="1804" w:type="dxa"/>
-          </w:tcPr>
-          <w:p>
-            <w:r>
-              <w:t>Pass</w:t>
-            </w:r>
-          </w:p>
-        </w:tc>
-      </w:tr>
-      <w:tr>
-        <w:tc>
-          <w:tcPr>
-            <w:tcW w:w="1803" w:type="dxa"/>
-          </w:tcPr>
-          <w:p>
-            <w:r>
-              <w:rPr>
-                <w:b/>
-              </w:rPr>
-              <w:t>Test Case 1-4</w:t>
-            </w:r>
-          </w:p>
-          <w:p>
-            <w:r>
-              <w:t>Course.createNewAssessment</w:t>
-            </w:r>
-          </w:p>
-          <w:p>
-            <w:r>
-              <w:t>Valid boundary input</w:t>
-            </w:r>
-          </w:p>
-        </w:tc>
-        <w:tc>
-          <w:tcPr>
-            <w:tcW w:w="1803" w:type="dxa"/>
-          </w:tcPr>
-          <w:p>
-            <w:r>
-              <w:t>"quiz1", "three word description", 1</w:t>
-            </w:r>
-          </w:p>
-          <w:p>
-            <w:r>
-              <w:t>Precondition: list empty</w:t>
-            </w:r>
-          </w:p>
-        </w:tc>
-        <w:tc>
-          <w:tcPr>
-            <w:tcW w:w="1803" w:type="dxa"/>
-          </w:tcPr>
-          <w:p>
-            <w:r>
-              <w:t>True (1 object stored with matching name, description and points)</w:t>
-            </w:r>
-          </w:p>
-        </w:tc>
-        <w:tc>
-          <w:tcPr>
-            <w:tcW w:w="1803" w:type="dxa"/>
-          </w:tcPr>
-          <w:p>
-            <w:r>
-              <w:t>True (list size 1, attributes match)</w:t>
-            </w:r>
-          </w:p>
-        </w:tc>
-        <w:tc>
-          <w:tcPr>
-            <w:tcW w:w="1804" w:type="dxa"/>
+            <w:pPr>
+              <w:rPr>
+                <w:rFonts w:asciiTheme="majorBidi" w:hAnsiTheme="majorBidi" w:cstheme="majorBidi"/>
+                <w:lang w:val="en-US"/>
+              </w:rPr>
+            </w:pPr>
+            <w:r>
+              <w:rPr>
+                <w:rFonts w:asciiTheme="majorBidi" w:hAnsiTheme="majorBidi" w:cstheme="majorBidi"/>
+                <w:lang w:val="en-US"/>
+              </w:rPr>
+              <w:t>Check the function with points that are not greater than 0 (Condition 4, boundary: 0).</w:t>
+            </w:r>
+          </w:p>
+          <w:p>
+            <w:r>
+              <w:rPr>
+                <w:rFonts w:asciiTheme="majorBidi" w:hAnsiTheme="majorBidi" w:cstheme="majorBidi"/>
+                <w:lang w:val="en-US"/>
+              </w:rPr>
+              <w:t>Precondition: list is empty (size = 0).</w:t>
+            </w:r>
+          </w:p>
+        </w:tc>
+        <w:tc>
+          <w:tcPr>
+            <w:tcW w:w="1654" w:type="dxa"/>
+          </w:tcPr>
+          <w:p>
+            <w:r>
+              <w:rPr>
+                <w:rFonts w:asciiTheme="majorBidi" w:hAnsiTheme="majorBidi" w:cstheme="majorBidi"/>
+                <w:lang w:val="en-US"/>
+              </w:rPr>
+              <w:t>("quiz1", "a valid description", 0)</w:t>
+            </w:r>
+          </w:p>
+        </w:tc>
+        <w:tc>
+          <w:tcPr>
+            <w:tcW w:w="1578" w:type="dxa"/>
+          </w:tcPr>
+          <w:p>
+            <w:r>
+              <w:rPr>
+                <w:rFonts w:asciiTheme="majorBidi" w:hAnsiTheme="majorBidi" w:cstheme="majorBidi"/>
+                <w:lang w:val="en-US"/>
+              </w:rPr>
+              <w:t>Creating this assessment should not be successful (returns false). The list size stays 0.</w:t>
+            </w:r>
+          </w:p>
+        </w:tc>
+        <w:tc>
+          <w:tcPr>
+            <w:tcW w:w="1527" w:type="dxa"/>
+          </w:tcPr>
+          <w:p>
+            <w:r>
+              <w:rPr>
+                <w:rFonts w:asciiTheme="majorBidi" w:hAnsiTheme="majorBidi" w:cstheme="majorBidi"/>
+                <w:lang w:val="en-US"/>
+              </w:rPr>
+              <w:t>Returned false. List size remained 0.</w:t>
+            </w:r>
+          </w:p>
+        </w:tc>
+        <w:tc>
+          <w:tcPr>
+            <w:tcW w:w="1346" w:type="dxa"/>
           </w:tcPr>
           <w:p>
             <w:r>

</xml_diff>